<commit_message>
Reenquadra relatorio: foco em previsao/prevencao de Don't Go
Ajusta resumo, objetivo central (introducao) e conclusao para posicionar
a previsao e prevencao de alertas Don't Go como objetivo central, com o
pipeline ETL como meio de apoio -- alinhando com as notas de revisao do
material de apoio que reforcam esse foco.
</commit_message>
<xml_diff>
--- a/Relatorio_Final_Vale_Desenvolver2026.docx
+++ b/Relatorio_Final_Vale_Desenvolver2026.docx
@@ -356,22 +356,12 @@
           <w:b/>
           <w:bCs/>
         </w:rPr>
-        <w:t>Este trabalho desenvolve uma solução de análise preditiva para antecipar alertas críticos (Don't Go) em equipamentos de mineração — caminhões e escavadeiras — a partir de 37.164.054 registros de telemetria coletados entre janeiro e junho de 2025. O desafio incluiu erros de qualidade de dados inseridos intencionalmente, dos quais 3 eram esperados (corrupção de encoding em Criticidade, string literal "NULL" em Classe, vírgula como separador decimal em Valor) e um quarto foi descoberto apenas ao processar o dataset completo: a mesma string "NULL" também aparecia na coluna Valor, afetando 237.443 registros.</w:t>
-        <w:br/>
-        <w:br/>
-        <w:t>A solução foi estruturada como um pipeline ETL reprodutível em 5 notebooks numerados (limpeza, EDA/validação de regras de negócio, feature engineering, treinamento de modelo e relatório final), apoiados por 7 módulos Python testados (64 testes unitários, desenvolvidos com TDD). As features incluem contagens de alarmes em 5 janelas deslizantes (15min a 4h), tempo desde o último alarme crítico, tipo de equipamento e estado operacional — todas calculadas sem vazamento temporal. O modelo é um XGBoost com scale_pos_weight para o desbalanceamento extremo das classes (1,4% a 2,6% de positivos, conforme o horizonte), treinado e avaliado com split temporal (treino: janeiro-abril; teste: maio-junho) para 3 horizontes de previsão (1h, 2h, 4h).</w:t>
-        <w:br/>
-        <w:br/>
-        <w:t>O horizonte de 4h apresentou o melhor F1-score (0,186 no threshold padrão; 0,207 no threshold 0,7), com recall de 57,7% e AUC de 0,767. A análise SHAP revelou que o tipo de equipamento é, isoladamente, a feature mais influente — mais que o dobro do impacto da segunda colocada (tempo desde o último alarme crítico) — sugerindo que o modelo captura majoritariamente um risco-base por tipo de equipamento, com o sinal dinâmico de alarmes contribuindo de forma secundária.</w:t>
-        <w:br/>
-        <w:br/>
-        <w:t>Rodar o pipeline na escala real (37M linhas, 16GB de RAM disponíveis) expôs limitações de implementação que os testes unitários com dados sintéticos não capturavam: colunas de string carregadas como object excediam a memória disponível, e a mesma coluna podia reverter de category para object durante a concatenação de meses com vocabulários diferentes. Ambos os problemas foram corrigidos via TDD antes de prosseguir, junto com uma incompatibilidade conhecida entre as versões pinadas de shap e xgboost na etapa de explicabilidade. O resultado é um pipeline auditável, com cada decisão técnica documentada em spec/DECISIONS.md, e métricas reportadas com transparência — incluindo suas limitações de precisão — em vez de apenas o resultado mais favorável.</w:t>
+        <w:t>Para sustentar essa previsão, a solução foi estruturada como um pipeline reprodutível em 5 notebooks numerados (limpeza, EDA/validação de regras de negócio, feature engineering, treinamento de modelo e relatório final), apoiados por 7 módulos Python testados (64 testes unitários, desenvolvidos com TDD). As features incluem contagens de alarmes em 5 janelas deslizantes (15min a 4h), tempo desde o último alarme crítico, tipo de equipamento e estado operacional — todas calculadas sem vazamento temporal. O modelo é um XGBoost com scale_pos_weight para o desbalanceamento extremo das classes (1,4% a 2,6% de positivos, conforme o horizonte), treinado e avaliado com split temporal (treino: janeiro-abril; teste: maio-junho) para 3 horizontes de previsão (1h, 2h, 4h).</w:t>
       </w:r>
       <w:r>
         <w:rPr>
           <w:rFonts w:ascii="Vale Sans" w:hAnsi="Vale Sans" w:cs="Calibri"/>
         </w:rPr>
-        <w:t/>
       </w:r>
     </w:p>
     <w:p>
@@ -540,7 +530,7 @@
           <w:lang w:val="pt-BR"/>
           <w14:ligatures w14:val="standardContextual"/>
         </w:rPr>
-        <w:t>O objetivo central deste trabalho é construir um pipeline de ETL robusto e reprodutível que limpe, valide e transforme os dados brutos de telemetria em um conjunto de features preditivas, e treinar um modelo de classificação capaz de prever a ocorrência de um Don't Go nas próximas 1h, 2h ou 4h, com avaliação honesta de desempenho (F1, precision, recall, AUC) e explicabilidade via SHAP.</w:t>
+        <w:t>O objetivo central deste trabalho é prever e prevenir a ocorrência de alertas Don't Go: antecipar, a partir do histórico de alarmes de um equipamento até o instante T, se um Don't Go ocorrerá nas próximas 1h, 2h ou 4h — para que a operação possa agir antes da parada, e não apenas registrá-la depois. Como meio para isso, construiu-se um pipeline robusto e reprodutível que limpa, valida e transforma os dados brutos de telemetria em um conjunto de features preditivas, sobre o qual se treina um modelo de classificação, com avaliação honesta de desempenho (F1, precision, recall, AUC) e explicabilidade via SHAP.</w:t>
       </w:r>
       <w:proofErr w:type="spellStart"/>
       <w:r>
@@ -552,7 +542,6 @@
           <w:lang w:val="pt-BR"/>
           <w14:ligatures w14:val="standardContextual"/>
         </w:rPr>
-        <w:t/>
       </w:r>
       <w:proofErr w:type="spellEnd"/>
       <w:r>
@@ -564,7 +553,6 @@
           <w:lang w:val="pt-BR"/>
           <w14:ligatures w14:val="standardContextual"/>
         </w:rPr>
-        <w:t/>
       </w:r>
     </w:p>
     <w:p>
@@ -791,7 +779,7 @@
           <w:lang w:eastAsia="pt-BR"/>
           <w14:ligatures w14:val="none"/>
         </w:rPr>
-        <w:t>O pipeline desenvolvido demonstra que é possível antecipar ocorrências de Don't Go com até 4 horas de antecedência, usando exclusivamente features derivadas do histórico de alarmes de telemetria, com um processo de ETL auditável e testado (64 testes, TDD) que escala dos dados sintéticos de teste até os 37 milhões de registros reais. As métricas obtidas — F1 entre 0,11 e 0,21 — são modestas em termos absolutos, mas refletem honestamente um problema com desbalanceamento extremo (abaixo de 3% de positivos) e uma feature dominante (tipo de equipamento) que sugere espaço real para melhoria nas features dinâmicas antes de uma eventual adoção em produção.</w:t>
+        <w:t>Este trabalho demonstra que é possível antecipar — e, com isso, apoiar a prevenção de — ocorrências de Don't Go com até 4 horas de antecedência, usando exclusivamente features derivadas do histórico de alarmes de telemetria, apoiado por um pipeline auditável e testado (64 testes, TDD) que escala dos dados sintéticos de teste até os 37 milhões de registros reais. As métricas obtidas — F1 entre 0,11 e 0,21 — são modestas em termos absolutos, mas refletem honestamente um problema com desbalanceamento extremo (abaixo de 3% de positivos) e uma feature dominante (tipo de equipamento) que sugere espaço real para melhoria nas features dinâmicas antes de uma eventual adoção em produção.</w:t>
       </w:r>
       <w:r>
         <w:rPr>
@@ -800,7 +788,6 @@
           <w:lang w:eastAsia="pt-BR"/>
           <w14:ligatures w14:val="none"/>
         </w:rPr>
-        <w:t/>
       </w:r>
     </w:p>
     <w:p>

</xml_diff>

<commit_message>
Fecha lacunas do Estudo Guiado: baseline, LightGBM, analise de erros e figuras
- Baselines (dummy + heuristica de dominio) e segunda abordagem LightGBM,
  avaliados no mesmo split temporal e nas mesmas features (src/baselines.py,
  src/lgbm_model.py). XGBoost segue como modelo escolhido (F1 0,186; AUC-PR 0,205),
  superando o melhor baseline ~4,9x em F1.
- Matriz de confusao e analise de erros do XGBoost (src/error_analysis.py):
  98% dos falsos negativos em escavadeiras; drift de recall maio (42%) -> junho (92%).
- Relatorio atualizado (fonte unica _fill_report.py): tabela comparativa de modelos,
  matriz de confusao, impacto de negocio quantificado, cenario de aplicacao e 6 figuras
  embutidas. Sem travessoes. Contagem corrigida para 10 modulos / 93 testes.
- Artefatos versionados em analysis/ e figures/ (agregados, sem dado bruto).
- 93 testes passando (29 novos, TDD). Dataset segue fora do repo (Edital 7.11).
</commit_message>
<xml_diff>
--- a/Relatorio_Final_Vale_Desenvolver2026.docx
+++ b/Relatorio_Final_Vale_Desenvolver2026.docx
@@ -140,7 +140,7 @@
           <w:szCs w:val="18"/>
           <w14:ligatures w14:val="none"/>
         </w:rPr>
-        <w:t>CEFET-MG — Engenharia de Computação</w:t>
+        <w:t>CEFET-MG, Engenharia de Computação</w:t>
       </w:r>
     </w:p>
     <w:p>
@@ -356,12 +356,13 @@
           <w:b/>
           <w:bCs/>
         </w:rPr>
-        <w:t>Para sustentar essa previsão, a solução foi estruturada como um pipeline reprodutível em 5 notebooks numerados (limpeza, EDA/validação de regras de negócio, feature engineering, treinamento de modelo e relatório final), apoiados por 7 módulos Python testados (64 testes unitários, desenvolvidos com TDD). As features incluem contagens de alarmes em 5 janelas deslizantes (15min a 4h), tempo desde o último alarme crítico, tipo de equipamento e estado operacional — todas calculadas sem vazamento temporal. O modelo é um XGBoost com scale_pos_weight para o desbalanceamento extremo das classes (1,4% a 2,6% de positivos, conforme o horizonte), treinado e avaliado com split temporal (treino: janeiro-abril; teste: maio-junho) para 3 horizontes de previsão (1h, 2h, 4h).</w:t>
+        <w:t>Este trabalho desenvolve uma solução de análise preditiva para antecipar e apoiar a prevenção de alertas críticos (Don't Go) em equipamentos de mineração (caminhões e escavadeiras), a partir de 37.164.054 registros de telemetria coletados entre janeiro e junho de 2025. Para sustentar essa previsão, a solução foi estruturada como um pipeline reprodutível em 5 notebooks numerados (limpeza, EDA/validação de regras de negócio, feature engineering, treinamento de modelo e relatório final), apoiados por 10 módulos Python testados (93 testes unitários, desenvolvidos com TDD). As features incluem contagens de alarmes em 5 janelas deslizantes (15min a 4h), tempo desde o último alarme crítico, tipo de equipamento e estado operacional, todas calculadas sem vazamento temporal. O modelo é um XGBoost com scale_pos_weight para o desbalanceamento extremo das classes (1,4% a 2,6% de positivos, conforme o horizonte), treinado e avaliado com split temporal (treino: janeiro-abril; teste: maio-junho) para 3 horizontes de previsão (1h, 2h, 4h). O modelo escolhido supera com folga baselines de referência (cerca de 4,9x em F1 sobre o melhor baseline) e foi comparado a uma segunda abordagem (LightGBM), com matriz de confusão e análise de erros para traduzir o desempenho em impacto operacional.</w:t>
       </w:r>
       <w:r>
         <w:rPr>
           <w:rFonts w:ascii="Vale Sans" w:hAnsi="Vale Sans" w:cs="Calibri"/>
         </w:rPr>
+        <w:t/>
       </w:r>
     </w:p>
     <w:p>
@@ -377,7 +378,7 @@
           <w:b/>
           <w:bCs/>
         </w:rPr>
-        <w:t>Palavras-Chave: Telemetria de Mineração; Manutenção Preditiva; XGBoost; Qualidade de Dados; SHAP</w:t>
+        <w:t>Palavras-Chave: Telemetria de Mineração; Manutenção Preditiva; XGBoost; LightGBM; Baseline; Qualidade de Dados; SHAP</w:t>
       </w:r>
       <w:proofErr w:type="spellStart"/>
       <w:r>
@@ -450,7 +451,7 @@
           <w:lang w:val="pt-BR"/>
           <w14:ligatures w14:val="standardContextual"/>
         </w:rPr>
-        <w:t>Equipamentos de mineração — caminhões e escavadeiras — geram constantemente alarmes de telemetria que registram o estado operacional e eventos de risco. Entre eles estão os alertas "Don't Go": situações em que o equipamento acumula um número de alarmes de determinado tipo dentro de uma janela de tempo, indicando risco operacional que exige parada ou intervenção. Antecipar esses eventos, em vez de apenas reagir a eles, permite à operação planejar manutenção, reduzir paradas não programadas e mitigar riscos de segurança — exemplificando como dados de telemetria, normalmente usados para diagnóstico retroativo, podem sustentar decisões operacionais proativas.</w:t>
+        <w:t>Equipamentos de mineração (caminhões e escavadeiras) geram constantemente alarmes de telemetria que registram o estado operacional e eventos de risco. Entre eles estão os alertas "Don't Go": situações em que o equipamento acumula um número de alarmes de determinado tipo dentro de uma janela de tempo, indicando risco operacional que exige parada ou intervenção. Antecipar esses eventos, em vez de apenas reagir a eles, permite à operação planejar manutenção, reduzir paradas não programadas e mitigar riscos de segurança, exemplificando como dados de telemetria, normalmente usados para diagnóstico retroativo, podem sustentar decisões operacionais proativas.</w:t>
       </w:r>
       <w:r>
         <w:rPr>
@@ -530,7 +531,7 @@
           <w:lang w:val="pt-BR"/>
           <w14:ligatures w14:val="standardContextual"/>
         </w:rPr>
-        <w:t>O objetivo central deste trabalho é prever e prevenir a ocorrência de alertas Don't Go: antecipar, a partir do histórico de alarmes de um equipamento até o instante T, se um Don't Go ocorrerá nas próximas 1h, 2h ou 4h — para que a operação possa agir antes da parada, e não apenas registrá-la depois. Como meio para isso, construiu-se um pipeline robusto e reprodutível que limpa, valida e transforma os dados brutos de telemetria em um conjunto de features preditivas, sobre o qual se treina um modelo de classificação, com avaliação honesta de desempenho (F1, precision, recall, AUC) e explicabilidade via SHAP.</w:t>
+        <w:t>O objetivo central deste trabalho é prever e prevenir a ocorrência de alertas Don't Go: antecipar, a partir do histórico de alarmes de um equipamento até o instante T, se um Don't Go ocorrerá nas próximas 1h, 2h ou 4h, para que a operação possa agir antes da parada, e não apenas registrá-la depois. Como meio para isso, construiu-se um pipeline robusto e reprodutível que limpa, valida e transforma os dados brutos de telemetria em um conjunto de features preditivas, sobre o qual se treina um modelo de classificação, com avaliação honesta de desempenho (F1, precision, recall, AUC) e explicabilidade via SHAP.</w:t>
       </w:r>
       <w:proofErr w:type="spellStart"/>
       <w:r>
@@ -542,6 +543,7 @@
           <w:lang w:val="pt-BR"/>
           <w14:ligatures w14:val="standardContextual"/>
         </w:rPr>
+        <w:t/>
       </w:r>
       <w:proofErr w:type="spellEnd"/>
       <w:r>
@@ -553,6 +555,7 @@
           <w:lang w:val="pt-BR"/>
           <w14:ligatures w14:val="standardContextual"/>
         </w:rPr>
+        <w:t/>
       </w:r>
     </w:p>
     <w:p>
@@ -603,7 +606,70 @@
           <w:lang w:val="pt-BR"/>
           <w14:ligatures w14:val="standardContextual"/>
         </w:rPr>
-        <w:t>Os dados de telemetria (37.164.054 registros, jan-jun/2025) registram cada alarme emitido por 35 equipamentos (TAGs), classificados por criticidade (crítico, não crítico, informacional) e tipo (caminhão ou escavadeira). Paralelamente, os apontamentos (377.907 registros) descrevem o estado operacional de cada equipamento ao longo do tempo (Operando, Parado, Hibernando, Manutenção). O sinal Is_Dont_Go, presente na telemetria, indica quando um equipamento atingiu o critério de parada definido pelas regras de negócio (136 regras, uma por tipo de alarme, definindo quantidade de ocorrências e janela de tempo). Esses dados existem porque a operação precisa rastrear, auditar e justificar paradas de equipamento — tanto por segurança quanto por eficiência de frota. Antecipar esse sinal, em vez de apenas registrá-lo, é o que transforma esses dados de um registro histórico em uma ferramenta de decisão: o time de operação pode agir antes da parada ocorrer, e não apenas explicá-la depois.</w:t>
+        <w:t>Os dados de telemetria (37.164.054 registros, jan-jun/2025) registram cada alarme emitido por 35 equipamentos (TAGs), classificados por criticidade (crítico, não crítico, informacional) e tipo (caminhão ou escavadeira). Paralelamente, os apontamentos (377.907 registros) descrevem o estado operacional de cada equipamento ao longo do tempo (Operando, Parado, Hibernando, Manutenção). O sinal Is_Dont_Go, presente na telemetria, indica quando um equipamento atingiu o critério de parada definido pelas regras de negócio (136 regras, uma por tipo de alarme, definindo quantidade de ocorrências e janela de tempo). Esses dados existem porque a operação precisa rastrear, auditar e justificar paradas de equipamento, tanto por segurança quanto por eficiência de frota. Antecipar esse sinal, em vez de apenas registrá-lo, é o que transforma esses dados de um registro histórico em uma ferramenta de decisão: o time de operação pode agir antes da parada ocorrer, e não apenas explicá-la depois.</w:t>
+      </w:r>
+    </w:p>
+    <w:p>
+      <w:pPr>
+        <w:pStyle w:val="Commarcadores"/>
+      </w:pPr>
+      <w:r>
+        <w:rPr>
+          <w:b w:val="0"/>
+          <w:i w:val="0"/>
+        </w:rPr>
+        <w:t>Do ponto de vista de negócio, o sucesso da solução é medido pela sua capacidade de antecipar Don't Go com antecedência útil para a operação: a métrica-alvo primária é a fração de Don't Go reais sinalizados antes de ocorrerem (recall), condicionada a um volume de alertas que a equipe consiga triar (precision operacionalmente aceitável). Um cenário concreto de aplicação: um alerta no painel do dispatcher indicando, com até 4 horas de antecedência, que determinado equipamento tem risco elevado de Don't Go, permitindo reprogramar a frota, antecipar inspeção ou manutenção e evitar a parada não planejada no meio do ciclo produtivo. Nesse enquadramento, cada Don't Go antecipado é uma parada potencialmente convertida de não planejada em planejada.</w:t>
+      </w:r>
+    </w:p>
+    <w:p>
+      <w:pPr>
+        <w:jc w:val="center"/>
+      </w:pPr>
+      <w:r>
+        <w:drawing>
+          <wp:inline xmlns:a="http://schemas.openxmlformats.org/drawingml/2006/main" xmlns:pic="http://schemas.openxmlformats.org/drawingml/2006/picture">
+            <wp:extent cx="5486400" cy="1567543"/>
+            <wp:docPr id="1" name="Picture 1"/>
+            <wp:cNvGraphicFramePr>
+              <a:graphicFrameLocks noChangeAspect="1"/>
+            </wp:cNvGraphicFramePr>
+            <a:graphic>
+              <a:graphicData uri="http://schemas.openxmlformats.org/drawingml/2006/picture">
+                <pic:pic>
+                  <pic:nvPicPr>
+                    <pic:cNvPr id="0" name="eda_dontgo_timeline.png"/>
+                    <pic:cNvPicPr/>
+                  </pic:nvPicPr>
+                  <pic:blipFill>
+                    <a:blip r:embed="rId18"/>
+                    <a:stretch>
+                      <a:fillRect/>
+                    </a:stretch>
+                  </pic:blipFill>
+                  <pic:spPr>
+                    <a:xfrm>
+                      <a:off x="0" y="0"/>
+                      <a:ext cx="5486400" cy="1567543"/>
+                    </a:xfrm>
+                    <a:prstGeom prst="rect"/>
+                  </pic:spPr>
+                </pic:pic>
+              </a:graphicData>
+            </a:graphic>
+          </wp:inline>
+        </w:drawing>
+      </w:r>
+    </w:p>
+    <w:p>
+      <w:pPr>
+        <w:jc w:val="center"/>
+      </w:pPr>
+      <w:r>
+        <w:rPr>
+          <w:b w:val="0"/>
+          <w:i/>
+        </w:rPr>
+        <w:t>Figura 1: Série temporal de ocorrências de Don't Go ao longo do período (jan-jun/2025).</w:t>
       </w:r>
     </w:p>
     <w:p>
@@ -654,7 +720,7 @@
           <w:lang w:val="pt-BR"/>
           <w14:ligatures w14:val="standardContextual"/>
         </w:rPr>
-        <w:t>O pipeline é dividido em 5 notebooks numerados e 7 módulos Python testados (src/loader.py, cleaner.py, validator.py, business_rules.py, features.py, model.py, utils.py — 64 testes unitários, desenvolvidos com TDD). A arquitetura segue: (1) carregamento e limpeza dos 6 arquivos mensais de telemetria e dos apontamentos; (2) EDA e validação das regras de negócio, reproduzindo o sinal Is_Dont_Go via janela deslizante e comparando com o sinal registrado; (3) feature engineering — contagens de alarmes em 5 janelas (15min, 30min, 1h, 2h, 4h), tempo desde o último alarme crítico, tipo de equipamento e estado operacional, calculadas com pandas .rolling() e np.searchsorted (O(n log n) por equipamento, vetorizado — essencial para os 37M registros); (4) treinamento de um XGBoost com scale_pos_weight para o desbalanceamento de classes, split temporal (treino jan-abr, teste mai-jun, nunca aleatório, para não vazar informação do futuro) e avaliação em 3 horizontes; (5) explicabilidade via SHAP e consolidação do relatório final.</w:t>
+        <w:t>O pipeline é dividido em 5 notebooks numerados e um conjunto de 10 módulos Python testados (src/loader.py, cleaner.py, validator.py, business_rules.py, features.py, model.py, utils.py, além de baselines.py, lgbm_model.py e error_analysis.py para a comparação de modelos e a análise de erros, 93 testes unitários, desenvolvidos com TDD). A arquitetura segue: (1) carregamento e limpeza dos 6 arquivos mensais de telemetria e dos apontamentos; (2) EDA e validação das regras de negócio, reproduzindo o sinal Is_Dont_Go via janela deslizante e comparando com o sinal registrado; (3) feature engineering: contagens de alarmes em 5 janelas (15min, 30min, 1h, 2h, 4h), tempo desde o último alarme crítico, tipo de equipamento e estado operacional, calculadas com pandas .rolling() e np.searchsorted (O(n log n) por equipamento, vetorizado, essencial para os 37M registros); (4) treinamento de um XGBoost com scale_pos_weight para o desbalanceamento de classes, split temporal (treino jan-abr, teste mai-jun, nunca aleatório, para não vazar informação do futuro) e avaliação em 3 horizontes; (5) explicabilidade via SHAP e consolidação do relatório final.</w:t>
       </w:r>
     </w:p>
     <w:p>
@@ -683,7 +749,58 @@
           <w:lang w:val="pt-BR"/>
           <w14:ligatures w14:val="standardContextual"/>
         </w:rPr>
-        <w:t>A principal dificuldade técnica foi escalar o pipeline das fixtures sintéticas usadas nos testes (5 a 15 linhas) para os 37M registros reais, em uma máquina com 16GB de RAM. Colunas de string carregadas como object (em vez de category) projetavam ~30GB de uso de memória; corrigido convertendo para category no carregamento. Um problema mais sutil surgiu na concatenação dos 6 meses: o pandas reverte category para object quando o conjunto de categorias difere entre os meses (TAGs e operadores que só aparecem em parte do ano) — corrigido unificando o CategoricalDtype antes do concat. O mesmo padrão de memória se repetiu na feature current_state (apenas 5 valores possíveis, mas calculada como object) e na cópia de colunas não utilizadas dentro de build_features. Cada um desses problemas foi reproduzido com um teste antes da correção (TDD), e a suíte completa (64 testes) permanece verde. Adicionalmente, o dataset real revelou um quarto erro de qualidade não documentado (string 'NULL' também em Valor, 237.443 registros) e expôs uma incompatibilidade de versão entre shap e xgboost na etapa de explicabilidade, documentados em spec/DECISIONS.md (D008).</w:t>
+        <w:t>A principal dificuldade técnica foi escalar o pipeline das fixtures sintéticas usadas nos testes (5 a 15 linhas) para os 37M registros reais, em uma máquina com 16GB de RAM. Colunas de string carregadas como object (em vez de category) projetavam ~30GB de uso de memória; corrigido convertendo para category no carregamento. Um problema mais sutil surgiu na concatenação dos 6 meses: o pandas reverte category para object quando o conjunto de categorias difere entre os meses (TAGs e operadores que só aparecem em parte do ano), corrigido unificando o CategoricalDtype antes do concat. O mesmo padrão de memória se repetiu na feature current_state (apenas 5 valores possíveis, mas calculada como object) e na cópia de colunas não utilizadas dentro de build_features. Cada um desses problemas foi reproduzido com um teste antes da correção (TDD), e a suíte completa (93 testes) permanece verde. Adicionalmente, o dataset real revelou um quarto erro de qualidade não documentado (string 'NULL' também em Valor, 237.443 registros) e expôs uma incompatibilidade de versão entre shap e xgboost na etapa de explicabilidade, documentados em spec/DECISIONS.md (D008).</w:t>
+      </w:r>
+    </w:p>
+    <w:p>
+      <w:pPr>
+        <w:jc w:val="center"/>
+      </w:pPr>
+      <w:r>
+        <w:drawing>
+          <wp:inline xmlns:a="http://schemas.openxmlformats.org/drawingml/2006/main" xmlns:pic="http://schemas.openxmlformats.org/drawingml/2006/picture">
+            <wp:extent cx="5486400" cy="3429000"/>
+            <wp:docPr id="2" name="Picture 2"/>
+            <wp:cNvGraphicFramePr>
+              <a:graphicFrameLocks noChangeAspect="1"/>
+            </wp:cNvGraphicFramePr>
+            <a:graphic>
+              <a:graphicData uri="http://schemas.openxmlformats.org/drawingml/2006/picture">
+                <pic:pic>
+                  <pic:nvPicPr>
+                    <pic:cNvPr id="0" name="feature_correlation.png"/>
+                    <pic:cNvPicPr/>
+                  </pic:nvPicPr>
+                  <pic:blipFill>
+                    <a:blip r:embed="rId19"/>
+                    <a:stretch>
+                      <a:fillRect/>
+                    </a:stretch>
+                  </pic:blipFill>
+                  <pic:spPr>
+                    <a:xfrm>
+                      <a:off x="0" y="0"/>
+                      <a:ext cx="5486400" cy="3429000"/>
+                    </a:xfrm>
+                    <a:prstGeom prst="rect"/>
+                  </pic:spPr>
+                </pic:pic>
+              </a:graphicData>
+            </a:graphic>
+          </wp:inline>
+        </w:drawing>
+      </w:r>
+    </w:p>
+    <w:p>
+      <w:pPr>
+        <w:jc w:val="center"/>
+      </w:pPr>
+      <w:r>
+        <w:rPr>
+          <w:b w:val="0"/>
+          <w:i/>
+        </w:rPr>
+        <w:t>Figura 2: Matriz de correlação entre as features preditivas engenheiradas.</w:t>
       </w:r>
     </w:p>
     <w:p>
@@ -725,19 +842,714 @@
           <w:lang w:eastAsia="pt-BR"/>
           <w14:ligatures w14:val="none"/>
         </w:rPr>
-        <w:t>O diagnóstico de qualidade identificou e corrigiu 4 problemas nos 37.164.054 registros de telemetria: 11 registros com corrupção de encoding em Criticidade, 36.104.611 registros com string literal 'NULL' em Classe, 237.443 registros com a mesma string 'NULL' em Valor, e 821.849 registros com vírgula como separador decimal em Valor. A reprodução do sinal Is_Dont_Go via janela deslizante, validada em uma amostra de 50 mil registros contra as 136 regras de negócio, obteve precision de 0,12 e recall de 0,59 — indicando que as regras documentadas capturam a maioria dos casos reais, mas com taxa relevante de falsos positivos.</w:t>
+        <w:t>O diagnóstico de qualidade identificou e corrigiu 4 problemas nos 37.164.054 registros de telemetria: 11 registros com corrupção de encoding em Criticidade, 36.104.611 registros com string literal 'NULL' em Classe, 237.443 registros com a mesma string 'NULL' em Valor, e 821.849 registros com vírgula como separador decimal em Valor. A reprodução do sinal Is_Dont_Go via janela deslizante, validada em uma amostra de 50 mil registros contra as 136 regras de negócio, obteve precision de 0,12 e recall de 0,59, indicando que as regras documentadas capturam a maioria dos casos reais, mas com taxa relevante de falsos positivos.</w:t>
       </w:r>
     </w:p>
     <w:p>
       <w:pPr/>
       <w:r>
-        <w:t>O modelo XGBoost foi treinado e avaliado para os 3 horizontes propostos, com split temporal (23.273.520 registros de treino, 13.890.534 de teste). O horizonte de 4 horas apresentou o melhor F1-score (0,186 no threshold 0,5; 0,207 no threshold 0,7), superando 1h (F1=0,114) e 2h (F1=0,143) — mesmo com AUC mais baixo (0,767 vs. 0,883 em 1h), o que indica uma fronteira de decisão mais bem calibrada para a métrica de negócio (F1), ainda que a capacidade geral de ranqueamento (AUC) seja menor. Em todos os horizontes, o recall é consideravelmente maior que a precision (ex: recall=0,577 vs. precision=0,111 em 4h/threshold 0,5) — esperado dado o desbalanceamento extremo das classes e a escolha de scale_pos_weight, que privilegia não perder eventos reais de Don't Go ao custo de mais falsos positivos. Aumentar o threshold para 0,7 melhora a precision (de 0,111 para 0,126) com perda mínima de recall (de 0,577 para 0,574), sugerindo que esse ajuste é preferível ao padrão de 0,5 em produção.</w:t>
+        <w:rPr>
+          <w:b w:val="0"/>
+          <w:i w:val="0"/>
+        </w:rPr>
+        <w:t>O modelo XGBoost foi treinado e avaliado para os 3 horizontes propostos, com split temporal (23.273.520 registros de treino, 13.890.534 de teste). O horizonte de 4 horas apresentou o melhor F1-score (0,186 no threshold 0,5; 0,207 no threshold 0,7), superando 1h (F1=0,114) e 2h (F1=0,143), mesmo com AUC mais baixo (0,767 vs. 0,883 em 1h), o que indica uma fronteira de decisão mais bem calibrada para a métrica de negócio (F1), ainda que a capacidade geral de ranqueamento (AUC) seja menor. Em todos os horizontes, o recall é consideravelmente maior que a precision (ex: recall=0,577 vs. precision=0,111 em 4h/threshold 0,5), esperado dado o desbalanceamento extremo das classes e a escolha de scale_pos_weight, que privilegia não perder eventos reais de Don't Go ao custo de mais falsos positivos. Aumentar o threshold para 0,7 melhora a precision (de 0,111 para 0,126) com perda mínima de recall (de 0,577 para 0,574), sugerindo que esse ajuste é preferível ao padrão de 0,5 em produção.</w:t>
       </w:r>
     </w:p>
     <w:p>
       <w:pPr/>
       <w:r>
-        <w:t>A análise SHAP para o horizonte de 4h (shap_plots/shap_bar_label_4h.png) revelou que tipo_caminhao (caminhão vs. escavadeira) é, isoladamente, a feature mais influente — mais que o dobro do impacto de time_since_last_critical, a segunda colocada, e muito acima das contagens de alarme em qualquer janela. Esse resultado é uma limitação relevante a ser discutida com transparência: sugere que o modelo aprendeu majoritariamente uma diferença de risco-base entre os dois tipos de equipamento, em vez de um padrão dinâmico fino de comportamento de alarmes antes de um Don't Go. As features de contagem de alarme contribuem, mas com impacto bem menor — alarm_count_4h é a terceira mais relevante, seguida por uma queda abrupta nas janelas mais curtas (30m, 1h, 2h, 15m), coerente com o horizonte de 4h ser o melhor: alarmes acumulados em uma janela mais longa carregam mais sinal preditivo para esse horizonte do que rajadas de curto prazo.</w:t>
+        <w:rPr>
+          <w:b w:val="0"/>
+          <w:i w:val="0"/>
+        </w:rPr>
+        <w:t>Para situar esse desempenho, o modelo foi comparado a baselines de referência e a uma segunda abordagem (LightGBM), todos avaliados no mesmo split temporal e nas mesmas 8 features (label_4h). Os baselines vão do trivial (classificador que sempre prevê a classe majoritária, F1=0,000; e um estratificado, F1=0,022) a uma heurística de domínio (prever Don't Go quando há alarme crítico na última hora, F1=0,038). A base rate de positivos é de apenas 1,6%. Contra esse pano de fundo, o XGBoost alcança F1=0,186 e AUC-PR=0,205, superando o melhor baseline em cerca de 4,9x em F1 e cerca de 12,5x em AUC-PR sobre a base rate: o ganho é substancial e confirma que o modelo aprende sinal real, não apenas a proporção das classes. O LightGBM empata na prática (F1=0,185, AUC-PR=0,197), com AUC-ROC e recall marginalmente melhores (0,776 e 0,579), o que reforça a robustez do resultado por concordância entre duas famílias de gradient boosting. O XGBoost foi mantido como modelo escolhido por liderar em F1 e AUC-PR, as métricas mais informativas sob desbalanceamento extremo.</w:t>
+      </w:r>
+    </w:p>
+    <w:p>
+      <w:pPr>
+        <w:jc w:val="center"/>
+      </w:pPr>
+      <w:r>
+        <w:rPr>
+          <w:b w:val="0"/>
+          <w:i/>
+        </w:rPr>
+        <w:t>Tabela 1: Comparação de desempenho no split temporal de teste (label_4h, threshold 0,5).</w:t>
+      </w:r>
+    </w:p>
+    <w:tbl>
+      <w:tblPr>
+        <w:tblStyle w:val="Tabelacomgrade"/>
+        <w:tblW w:type="auto" w:w="0"/>
+        <w:tblLook w:firstColumn="1" w:firstRow="1" w:lastColumn="0" w:lastRow="0" w:noHBand="0" w:noVBand="1" w:val="04A0"/>
+      </w:tblPr>
+      <w:tblGrid>
+        <w:gridCol w:w="1417"/>
+        <w:gridCol w:w="1417"/>
+        <w:gridCol w:w="1417"/>
+        <w:gridCol w:w="1417"/>
+        <w:gridCol w:w="1417"/>
+        <w:gridCol w:w="1417"/>
+      </w:tblGrid>
+      <w:tr>
+        <w:tc>
+          <w:tcPr>
+            <w:tcW w:type="dxa" w:w="1417"/>
+          </w:tcPr>
+          <w:p>
+            <w:r/>
+            <w:r>
+              <w:rPr>
+                <w:b/>
+              </w:rPr>
+              <w:t>Modelo</w:t>
+            </w:r>
+          </w:p>
+        </w:tc>
+        <w:tc>
+          <w:tcPr>
+            <w:tcW w:type="dxa" w:w="1417"/>
+          </w:tcPr>
+          <w:p>
+            <w:r/>
+            <w:r>
+              <w:rPr>
+                <w:b/>
+              </w:rPr>
+              <w:t>Precision</w:t>
+            </w:r>
+          </w:p>
+        </w:tc>
+        <w:tc>
+          <w:tcPr>
+            <w:tcW w:type="dxa" w:w="1417"/>
+          </w:tcPr>
+          <w:p>
+            <w:r/>
+            <w:r>
+              <w:rPr>
+                <w:b/>
+              </w:rPr>
+              <w:t>Recall</w:t>
+            </w:r>
+          </w:p>
+        </w:tc>
+        <w:tc>
+          <w:tcPr>
+            <w:tcW w:type="dxa" w:w="1417"/>
+          </w:tcPr>
+          <w:p>
+            <w:r/>
+            <w:r>
+              <w:rPr>
+                <w:b/>
+              </w:rPr>
+              <w:t>F1</w:t>
+            </w:r>
+          </w:p>
+        </w:tc>
+        <w:tc>
+          <w:tcPr>
+            <w:tcW w:type="dxa" w:w="1417"/>
+          </w:tcPr>
+          <w:p>
+            <w:r/>
+            <w:r>
+              <w:rPr>
+                <w:b/>
+              </w:rPr>
+              <w:t>AUC-ROC</w:t>
+            </w:r>
+          </w:p>
+        </w:tc>
+        <w:tc>
+          <w:tcPr>
+            <w:tcW w:type="dxa" w:w="1417"/>
+          </w:tcPr>
+          <w:p>
+            <w:r/>
+            <w:r>
+              <w:rPr>
+                <w:b/>
+              </w:rPr>
+              <w:t>AUC-PR</w:t>
+            </w:r>
+          </w:p>
+        </w:tc>
+      </w:tr>
+      <w:tr>
+        <w:tc>
+          <w:tcPr>
+            <w:tcW w:type="dxa" w:w="1417"/>
+          </w:tcPr>
+          <w:p>
+            <w:r/>
+            <w:r>
+              <w:t>Dummy (mais frequente)</w:t>
+            </w:r>
+          </w:p>
+        </w:tc>
+        <w:tc>
+          <w:tcPr>
+            <w:tcW w:type="dxa" w:w="1417"/>
+          </w:tcPr>
+          <w:p>
+            <w:r/>
+            <w:r>
+              <w:t>0,000</w:t>
+            </w:r>
+          </w:p>
+        </w:tc>
+        <w:tc>
+          <w:tcPr>
+            <w:tcW w:type="dxa" w:w="1417"/>
+          </w:tcPr>
+          <w:p>
+            <w:r/>
+            <w:r>
+              <w:t>0,000</w:t>
+            </w:r>
+          </w:p>
+        </w:tc>
+        <w:tc>
+          <w:tcPr>
+            <w:tcW w:type="dxa" w:w="1417"/>
+          </w:tcPr>
+          <w:p>
+            <w:r/>
+            <w:r>
+              <w:t>0,000</w:t>
+            </w:r>
+          </w:p>
+        </w:tc>
+        <w:tc>
+          <w:tcPr>
+            <w:tcW w:type="dxa" w:w="1417"/>
+          </w:tcPr>
+          <w:p>
+            <w:r/>
+            <w:r>
+              <w:t>0,500</w:t>
+            </w:r>
+          </w:p>
+        </w:tc>
+        <w:tc>
+          <w:tcPr>
+            <w:tcW w:type="dxa" w:w="1417"/>
+          </w:tcPr>
+          <w:p>
+            <w:r/>
+            <w:r>
+              <w:t>0,016</w:t>
+            </w:r>
+          </w:p>
+        </w:tc>
+      </w:tr>
+      <w:tr>
+        <w:tc>
+          <w:tcPr>
+            <w:tcW w:type="dxa" w:w="1417"/>
+          </w:tcPr>
+          <w:p>
+            <w:r/>
+            <w:r>
+              <w:t>Dummy (estratificado)</w:t>
+            </w:r>
+          </w:p>
+        </w:tc>
+        <w:tc>
+          <w:tcPr>
+            <w:tcW w:type="dxa" w:w="1417"/>
+          </w:tcPr>
+          <w:p>
+            <w:r/>
+            <w:r>
+              <w:t>0,017</w:t>
+            </w:r>
+          </w:p>
+        </w:tc>
+        <w:tc>
+          <w:tcPr>
+            <w:tcW w:type="dxa" w:w="1417"/>
+          </w:tcPr>
+          <w:p>
+            <w:r/>
+            <w:r>
+              <w:t>0,032</w:t>
+            </w:r>
+          </w:p>
+        </w:tc>
+        <w:tc>
+          <w:tcPr>
+            <w:tcW w:type="dxa" w:w="1417"/>
+          </w:tcPr>
+          <w:p>
+            <w:r/>
+            <w:r>
+              <w:t>0,022</w:t>
+            </w:r>
+          </w:p>
+        </w:tc>
+        <w:tc>
+          <w:tcPr>
+            <w:tcW w:type="dxa" w:w="1417"/>
+          </w:tcPr>
+          <w:p>
+            <w:r/>
+            <w:r>
+              <w:t>0,500</w:t>
+            </w:r>
+          </w:p>
+        </w:tc>
+        <w:tc>
+          <w:tcPr>
+            <w:tcW w:type="dxa" w:w="1417"/>
+          </w:tcPr>
+          <w:p>
+            <w:r/>
+            <w:r>
+              <w:t>0,016</w:t>
+            </w:r>
+          </w:p>
+        </w:tc>
+      </w:tr>
+      <w:tr>
+        <w:tc>
+          <w:tcPr>
+            <w:tcW w:type="dxa" w:w="1417"/>
+          </w:tcPr>
+          <w:p>
+            <w:r/>
+            <w:r>
+              <w:t>Heurístico (critical_1h&gt;0)</w:t>
+            </w:r>
+          </w:p>
+        </w:tc>
+        <w:tc>
+          <w:tcPr>
+            <w:tcW w:type="dxa" w:w="1417"/>
+          </w:tcPr>
+          <w:p>
+            <w:r/>
+            <w:r>
+              <w:t>0,021</w:t>
+            </w:r>
+          </w:p>
+        </w:tc>
+        <w:tc>
+          <w:tcPr>
+            <w:tcW w:type="dxa" w:w="1417"/>
+          </w:tcPr>
+          <w:p>
+            <w:r/>
+            <w:r>
+              <w:t>0,210</w:t>
+            </w:r>
+          </w:p>
+        </w:tc>
+        <w:tc>
+          <w:tcPr>
+            <w:tcW w:type="dxa" w:w="1417"/>
+          </w:tcPr>
+          <w:p>
+            <w:r/>
+            <w:r>
+              <w:t>0,038</w:t>
+            </w:r>
+          </w:p>
+        </w:tc>
+        <w:tc>
+          <w:tcPr>
+            <w:tcW w:type="dxa" w:w="1417"/>
+          </w:tcPr>
+          <w:p>
+            <w:r/>
+            <w:r>
+              <w:t>0,529</w:t>
+            </w:r>
+          </w:p>
+        </w:tc>
+        <w:tc>
+          <w:tcPr>
+            <w:tcW w:type="dxa" w:w="1417"/>
+          </w:tcPr>
+          <w:p>
+            <w:r/>
+            <w:r>
+              <w:t>0,072</w:t>
+            </w:r>
+          </w:p>
+        </w:tc>
+      </w:tr>
+      <w:tr>
+        <w:tc>
+          <w:tcPr>
+            <w:tcW w:type="dxa" w:w="1417"/>
+          </w:tcPr>
+          <w:p>
+            <w:r/>
+            <w:r>
+              <w:t>XGBoost (escolhido)</w:t>
+            </w:r>
+          </w:p>
+        </w:tc>
+        <w:tc>
+          <w:tcPr>
+            <w:tcW w:type="dxa" w:w="1417"/>
+          </w:tcPr>
+          <w:p>
+            <w:r/>
+            <w:r>
+              <w:t>0,111</w:t>
+            </w:r>
+          </w:p>
+        </w:tc>
+        <w:tc>
+          <w:tcPr>
+            <w:tcW w:type="dxa" w:w="1417"/>
+          </w:tcPr>
+          <w:p>
+            <w:r/>
+            <w:r>
+              <w:t>0,577</w:t>
+            </w:r>
+          </w:p>
+        </w:tc>
+        <w:tc>
+          <w:tcPr>
+            <w:tcW w:type="dxa" w:w="1417"/>
+          </w:tcPr>
+          <w:p>
+            <w:r/>
+            <w:r>
+              <w:t>0,186</w:t>
+            </w:r>
+          </w:p>
+        </w:tc>
+        <w:tc>
+          <w:tcPr>
+            <w:tcW w:type="dxa" w:w="1417"/>
+          </w:tcPr>
+          <w:p>
+            <w:r/>
+            <w:r>
+              <w:t>0,767</w:t>
+            </w:r>
+          </w:p>
+        </w:tc>
+        <w:tc>
+          <w:tcPr>
+            <w:tcW w:type="dxa" w:w="1417"/>
+          </w:tcPr>
+          <w:p>
+            <w:r/>
+            <w:r>
+              <w:t>0,205</w:t>
+            </w:r>
+          </w:p>
+        </w:tc>
+      </w:tr>
+      <w:tr>
+        <w:tc>
+          <w:tcPr>
+            <w:tcW w:type="dxa" w:w="1417"/>
+          </w:tcPr>
+          <w:p>
+            <w:r/>
+            <w:r>
+              <w:t>LightGBM</w:t>
+            </w:r>
+          </w:p>
+        </w:tc>
+        <w:tc>
+          <w:tcPr>
+            <w:tcW w:type="dxa" w:w="1417"/>
+          </w:tcPr>
+          <w:p>
+            <w:r/>
+            <w:r>
+              <w:t>0,110</w:t>
+            </w:r>
+          </w:p>
+        </w:tc>
+        <w:tc>
+          <w:tcPr>
+            <w:tcW w:type="dxa" w:w="1417"/>
+          </w:tcPr>
+          <w:p>
+            <w:r/>
+            <w:r>
+              <w:t>0,579</w:t>
+            </w:r>
+          </w:p>
+        </w:tc>
+        <w:tc>
+          <w:tcPr>
+            <w:tcW w:type="dxa" w:w="1417"/>
+          </w:tcPr>
+          <w:p>
+            <w:r/>
+            <w:r>
+              <w:t>0,185</w:t>
+            </w:r>
+          </w:p>
+        </w:tc>
+        <w:tc>
+          <w:tcPr>
+            <w:tcW w:type="dxa" w:w="1417"/>
+          </w:tcPr>
+          <w:p>
+            <w:r/>
+            <w:r>
+              <w:t>0,776</w:t>
+            </w:r>
+          </w:p>
+        </w:tc>
+        <w:tc>
+          <w:tcPr>
+            <w:tcW w:type="dxa" w:w="1417"/>
+          </w:tcPr>
+          <w:p>
+            <w:r/>
+            <w:r>
+              <w:t>0,197</w:t>
+            </w:r>
+          </w:p>
+        </w:tc>
+      </w:tr>
+    </w:tbl>
+    <w:p>
+      <w:pPr>
+        <w:jc w:val="center"/>
+      </w:pPr>
+      <w:r>
+        <w:drawing>
+          <wp:inline xmlns:a="http://schemas.openxmlformats.org/drawingml/2006/main" xmlns:pic="http://schemas.openxmlformats.org/drawingml/2006/picture">
+            <wp:extent cx="5486400" cy="2743200"/>
+            <wp:docPr id="3" name="Picture 3"/>
+            <wp:cNvGraphicFramePr>
+              <a:graphicFrameLocks noChangeAspect="1"/>
+            </wp:cNvGraphicFramePr>
+            <a:graphic>
+              <a:graphicData uri="http://schemas.openxmlformats.org/drawingml/2006/picture">
+                <pic:pic>
+                  <pic:nvPicPr>
+                    <pic:cNvPr id="0" name="model_comparison.png"/>
+                    <pic:cNvPicPr/>
+                  </pic:nvPicPr>
+                  <pic:blipFill>
+                    <a:blip r:embed="rId20"/>
+                    <a:stretch>
+                      <a:fillRect/>
+                    </a:stretch>
+                  </pic:blipFill>
+                  <pic:spPr>
+                    <a:xfrm>
+                      <a:off x="0" y="0"/>
+                      <a:ext cx="5486400" cy="2743200"/>
+                    </a:xfrm>
+                    <a:prstGeom prst="rect"/>
+                  </pic:spPr>
+                </pic:pic>
+              </a:graphicData>
+            </a:graphic>
+          </wp:inline>
+        </w:drawing>
+      </w:r>
+    </w:p>
+    <w:p>
+      <w:pPr>
+        <w:jc w:val="center"/>
+      </w:pPr>
+      <w:r>
+        <w:rPr>
+          <w:b w:val="0"/>
+          <w:i/>
+        </w:rPr>
+        <w:t>Figura 3: Comparação de F1 e recall entre baselines e os modelos (label_4h).</w:t>
+      </w:r>
+    </w:p>
+    <w:p>
+      <w:pPr>
+        <w:jc w:val="center"/>
+      </w:pPr>
+      <w:r>
+        <w:drawing>
+          <wp:inline xmlns:a="http://schemas.openxmlformats.org/drawingml/2006/main" xmlns:pic="http://schemas.openxmlformats.org/drawingml/2006/picture">
+            <wp:extent cx="5486400" cy="2194560"/>
+            <wp:docPr id="4" name="Picture 4"/>
+            <wp:cNvGraphicFramePr>
+              <a:graphicFrameLocks noChangeAspect="1"/>
+            </wp:cNvGraphicFramePr>
+            <a:graphic>
+              <a:graphicData uri="http://schemas.openxmlformats.org/drawingml/2006/picture">
+                <pic:pic>
+                  <pic:nvPicPr>
+                    <pic:cNvPr id="0" name="roc_pr_curves.png"/>
+                    <pic:cNvPicPr/>
+                  </pic:nvPicPr>
+                  <pic:blipFill>
+                    <a:blip r:embed="rId21"/>
+                    <a:stretch>
+                      <a:fillRect/>
+                    </a:stretch>
+                  </pic:blipFill>
+                  <pic:spPr>
+                    <a:xfrm>
+                      <a:off x="0" y="0"/>
+                      <a:ext cx="5486400" cy="2194560"/>
+                    </a:xfrm>
+                    <a:prstGeom prst="rect"/>
+                  </pic:spPr>
+                </pic:pic>
+              </a:graphicData>
+            </a:graphic>
+          </wp:inline>
+        </w:drawing>
+      </w:r>
+    </w:p>
+    <w:p>
+      <w:pPr>
+        <w:jc w:val="center"/>
+      </w:pPr>
+      <w:r>
+        <w:rPr>
+          <w:b w:val="0"/>
+          <w:i/>
+        </w:rPr>
+        <w:t>Figura 4: Curvas ROC e Precision-Recall dos modelos avaliados (label_4h).</w:t>
+      </w:r>
+    </w:p>
+    <w:p>
+      <w:pPr/>
+      <w:r>
+        <w:rPr>
+          <w:b w:val="0"/>
+          <w:i w:val="0"/>
+        </w:rPr>
+        <w:t>A matriz de confusão do XGBoost (label_4h, threshold 0,7, teste de maio-junho, N=13.890.534) detalha o comportamento operacional do modelo: 130.705 verdadeiros positivos (TP), 907.848 falsos positivos (FP), 96.918 falsos negativos (FN) e 12.755.063 verdadeiros negativos (TN), para 227.623 Don't Go reais no período (recall 57,4%, precision 12,6%). Em termos de impacto, cada FN é um Don't Go não antecipado, ou seja, uma parada não planejada que passou sem alerta, enquanto cada FP é um alerta sem Don't Go correspondente, que gera uma inspeção potencialmente desnecessária. A análise dos falsos negativos revela um insight não óbvio: 98,0% deles (94.932 de 96.918) ocorrem em escavadeiras e apenas 2,0% em caminhões, e 95,7% acontecem com o equipamento no estado Operando; além disso, 99,9% caem na faixa de alarm_count_4h maior ou igual a 21, indicando que o modelo falha justamente quando há muitos alarmes acumulados em escavadeiras. Há ainda um drift temporal marcante: o recall é de apenas 42,3% em maio, mas sobe para 92,2% em junho, concentrando a maioria dos FN no primeiro mês de teste. Como limitação honesta, a precision baixa (12,6%) significa que a maior parte dos alertas é falso positivo, o que exige uma etapa de triagem, e a lacuna de recall em escavadeiras somada ao drift de maio indica que o modelo ainda não generaliza de forma estável entre tipos de equipamento e períodos.</w:t>
+      </w:r>
+    </w:p>
+    <w:p>
+      <w:pPr>
+        <w:jc w:val="center"/>
+      </w:pPr>
+      <w:r>
+        <w:drawing>
+          <wp:inline xmlns:a="http://schemas.openxmlformats.org/drawingml/2006/main" xmlns:pic="http://schemas.openxmlformats.org/drawingml/2006/picture">
+            <wp:extent cx="5486400" cy="5028302"/>
+            <wp:docPr id="5" name="Picture 5"/>
+            <wp:cNvGraphicFramePr>
+              <a:graphicFrameLocks noChangeAspect="1"/>
+            </wp:cNvGraphicFramePr>
+            <a:graphic>
+              <a:graphicData uri="http://schemas.openxmlformats.org/drawingml/2006/picture">
+                <pic:pic>
+                  <pic:nvPicPr>
+                    <pic:cNvPr id="0" name="confusion_matrix_4h.png"/>
+                    <pic:cNvPicPr/>
+                  </pic:nvPicPr>
+                  <pic:blipFill>
+                    <a:blip r:embed="rId22"/>
+                    <a:stretch>
+                      <a:fillRect/>
+                    </a:stretch>
+                  </pic:blipFill>
+                  <pic:spPr>
+                    <a:xfrm>
+                      <a:off x="0" y="0"/>
+                      <a:ext cx="5486400" cy="5028302"/>
+                    </a:xfrm>
+                    <a:prstGeom prst="rect"/>
+                  </pic:spPr>
+                </pic:pic>
+              </a:graphicData>
+            </a:graphic>
+          </wp:inline>
+        </w:drawing>
+      </w:r>
+    </w:p>
+    <w:p>
+      <w:pPr>
+        <w:jc w:val="center"/>
+      </w:pPr>
+      <w:r>
+        <w:rPr>
+          <w:b w:val="0"/>
+          <w:i/>
+        </w:rPr>
+        <w:t>Figura 5: Matriz de confusão do XGBoost (label_4h, threshold 0,7) com impacto operacional.</w:t>
+      </w:r>
+    </w:p>
+    <w:p>
+      <w:pPr/>
+      <w:r>
+        <w:rPr>
+          <w:b w:val="0"/>
+          <w:i w:val="0"/>
+        </w:rPr>
+        <w:t>Traduzindo o desempenho em impacto de negócio: com recall de 57,4% no threshold 0,7, o modelo teria antecipado cerca de 130.700 dos 227.623 Don't Go do bimestre de teste (maio-junho), sinalizando-os com até 4 horas de antecedência. O valor em horas de parada evitada depende de uma premissa operacional que deve ser calibrada com a operação: se cada Don't Go antecipado permite converter em planejada uma parada não planejada que, na média, custaria H horas de indisponibilidade, então o modelo evitaria da ordem de 130.700 x H horas de parada não planejada no período. A título ilustrativo, adotando a premissa conservadora de H = 1 hora por evento, isso corresponde a aproximadamente 130.700 horas de parada não planejada mitigadas no bimestre; o número escala linearmente com H e deve ser substituído pelo tempo médio real de parada assim que disponível. Essa estimativa não considera o custo dos falsos positivos (inspeções desnecessárias), que deve ser ponderado contra o benefício ao definir o threshold de operação.</w:t>
+      </w:r>
+    </w:p>
+    <w:p>
+      <w:pPr/>
+      <w:r>
+        <w:rPr>
+          <w:b w:val="0"/>
+          <w:i w:val="0"/>
+        </w:rPr>
+        <w:t>A análise SHAP para o horizonte de 4h revelou que tipo_caminhao (caminhão vs. escavadeira) é, isoladamente, a feature mais influente, mais que o dobro do impacto de time_since_last_critical, a segunda colocada, e muito acima das contagens de alarme em qualquer janela. Esse resultado é uma limitação relevante a ser discutida com transparência: sugere que o modelo aprendeu majoritariamente uma diferença de risco-base entre os dois tipos de equipamento, em vez de um padrão dinâmico fino de comportamento de alarmes antes de um Don't Go, o que é coerente com a concentração de falsos negativos em escavadeiras observada na matriz de confusão. As features de contagem de alarme contribuem, mas com impacto bem menor, alarm_count_4h é a terceira mais relevante, seguida por uma queda abrupta nas janelas mais curtas (30m, 1h, 2h, 15m), coerente com o horizonte de 4h ser o melhor: alarmes acumulados em uma janela mais longa carregam mais sinal preditivo para esse horizonte do que rajadas de curto prazo.</w:t>
+      </w:r>
+    </w:p>
+    <w:p>
+      <w:pPr>
+        <w:jc w:val="center"/>
+      </w:pPr>
+      <w:r>
+        <w:drawing>
+          <wp:inline xmlns:a="http://schemas.openxmlformats.org/drawingml/2006/main" xmlns:pic="http://schemas.openxmlformats.org/drawingml/2006/picture">
+            <wp:extent cx="5486400" cy="3254885"/>
+            <wp:docPr id="6" name="Picture 6"/>
+            <wp:cNvGraphicFramePr>
+              <a:graphicFrameLocks noChangeAspect="1"/>
+            </wp:cNvGraphicFramePr>
+            <a:graphic>
+              <a:graphicData uri="http://schemas.openxmlformats.org/drawingml/2006/picture">
+                <pic:pic>
+                  <pic:nvPicPr>
+                    <pic:cNvPr id="0" name="shap_summary_label_4h.png"/>
+                    <pic:cNvPicPr/>
+                  </pic:nvPicPr>
+                  <pic:blipFill>
+                    <a:blip r:embed="rId23"/>
+                    <a:stretch>
+                      <a:fillRect/>
+                    </a:stretch>
+                  </pic:blipFill>
+                  <pic:spPr>
+                    <a:xfrm>
+                      <a:off x="0" y="0"/>
+                      <a:ext cx="5486400" cy="3254885"/>
+                    </a:xfrm>
+                    <a:prstGeom prst="rect"/>
+                  </pic:spPr>
+                </pic:pic>
+              </a:graphicData>
+            </a:graphic>
+          </wp:inline>
+        </w:drawing>
+      </w:r>
+    </w:p>
+    <w:p>
+      <w:pPr>
+        <w:jc w:val="center"/>
+      </w:pPr>
+      <w:r>
+        <w:rPr>
+          <w:b w:val="0"/>
+          <w:i/>
+        </w:rPr>
+        <w:t>Figura 6: Resumo SHAP das features para o horizonte de 4h (impacto por feature).</w:t>
       </w:r>
     </w:p>
     <w:p>
@@ -779,7 +1591,7 @@
           <w:lang w:eastAsia="pt-BR"/>
           <w14:ligatures w14:val="none"/>
         </w:rPr>
-        <w:t>Este trabalho demonstra que é possível antecipar — e, com isso, apoiar a prevenção de — ocorrências de Don't Go com até 4 horas de antecedência, usando exclusivamente features derivadas do histórico de alarmes de telemetria, apoiado por um pipeline auditável e testado (64 testes, TDD) que escala dos dados sintéticos de teste até os 37 milhões de registros reais. As métricas obtidas — F1 entre 0,11 e 0,21 — são modestas em termos absolutos, mas refletem honestamente um problema com desbalanceamento extremo (abaixo de 3% de positivos) e uma feature dominante (tipo de equipamento) que sugere espaço real para melhoria nas features dinâmicas antes de uma eventual adoção em produção.</w:t>
+        <w:t>Este trabalho demonstra que é possível antecipar e, com isso, apoiar a prevenção de ocorrências de Don't Go com até 4 horas de antecedência, usando exclusivamente features derivadas do histórico de alarmes de telemetria, apoiado por um pipeline auditável e testado (93 testes, TDD) que escala dos dados sintéticos de teste até os 37 milhões de registros reais. O modelo escolhido supera com folga os baselines de referência (cerca de 4,9x em F1 sobre o melhor baseline) e, com recall de 57%, teria antecipado cerca de 130.700 dos 227.623 Don't Go do bimestre de teste. As métricas absolutas (F1 entre 0,11 e 0,21) são modestas, mas refletem honestamente um problema com desbalanceamento extremo (abaixo de 3% de positivos), uma feature dominante (tipo de equipamento) e uma lacuna de recall em escavadeiras, que apontam espaço real para melhoria nas features dinâmicas antes de uma eventual adoção em produção.</w:t>
       </w:r>
       <w:r>
         <w:rPr>
@@ -788,6 +1600,7 @@
           <w:lang w:eastAsia="pt-BR"/>
           <w14:ligatures w14:val="none"/>
         </w:rPr>
+        <w:t/>
       </w:r>
     </w:p>
     <w:p>
@@ -816,7 +1629,7 @@
         <w:pStyle w:val="Commarcadores"/>
       </w:pPr>
       <w:r>
-        <w:t>Comparar XGBoost com LightGBM nos 3 horizontes, e testar SMOTE como ablação ao scale_pos_weight.</w:t>
+        <w:t>Tratar a lacuna de recall em escavadeiras, onde se concentram 98% dos falsos negativos, com calibração ou modelo específico para esse tipo de equipamento.</w:t>
       </w:r>
     </w:p>
     <w:p>
@@ -824,6 +1637,14 @@
         <w:pStyle w:val="Commarcadores"/>
       </w:pPr>
       <w:r>
+        <w:t>Mitigar o drift temporal observado entre maio e junho (recall de 42% para 92%) com re-treinamento periódico e monitoramento contínuo da distribuição das features.</w:t>
+      </w:r>
+    </w:p>
+    <w:p>
+      <w:pPr>
+        <w:pStyle w:val="Commarcadores"/>
+      </w:pPr>
+      <w:r>
         <w:t>Adicionar features de turno, frequência de manutenções recentes e localidade.</w:t>
       </w:r>
     </w:p>
@@ -832,15 +1653,7 @@
         <w:pStyle w:val="Commarcadores"/>
       </w:pPr>
       <w:r>
-        <w:t>Construir um dashboard (ex: Streamlit) para consulta de risco por equipamento em tempo real.</w:t>
-      </w:r>
-    </w:p>
-    <w:p>
-      <w:pPr>
-        <w:pStyle w:val="Commarcadores"/>
-      </w:pPr>
-      <w:r>
-        <w:t>Monitorar concept drift na distribuição das features entre os períodos de treino e teste.</w:t>
+        <w:t>Construir um dashboard (ex: Streamlit) para consulta de risco por equipamento em tempo real, materializando o alerta do dispatcher descrito no entendimento do negócio.</w:t>
       </w:r>
     </w:p>
     <w:sectPr>

</xml_diff>